<commit_message>
Add new images and update bibliography entries
- Added new image files: image.png and placeholder.png to the resources.
- Enhanced bibliography with additional entries for Siemens AG manuals and online resources, including:
  - SENTRON Schutzschaltgeräte Systemhandbuch
  - SENTRON Modbus Register Map
  - Desigo CC Engineering Help
- Created a notes.txt file containing feedback and suggestions for document improvements, including formatting, content clarity, and scope definitions.
</commit_message>
<xml_diff>
--- a/[META] Bachelorarbeit Guide.docx
+++ b/[META] Bachelorarbeit Guide.docx
@@ -14,9 +14,11 @@
       <w:pPr>
         <w:pStyle w:val="berschrift1"/>
       </w:pPr>
+      <w:proofErr w:type="spellStart"/>
       <w:r>
         <w:t>QModMaster</w:t>
       </w:r>
+      <w:proofErr w:type="spellEnd"/>
     </w:p>
     <w:p>
       <w:pPr>
@@ -63,7 +65,39 @@
         </w:numPr>
       </w:pPr>
       <w:r>
-        <w:t>illegal data adress: falsche Adresse, schauen ob base adress unter Options passt, um die richtigen Werte aus der Tabelle verwenden zu können muss hier 1 sein</w:t>
+        <w:t xml:space="preserve">illegal </w:t>
+      </w:r>
+      <w:proofErr w:type="spellStart"/>
+      <w:r>
+        <w:t>data</w:t>
+      </w:r>
+      <w:proofErr w:type="spellEnd"/>
+      <w:r>
+        <w:t xml:space="preserve"> </w:t>
+      </w:r>
+      <w:proofErr w:type="spellStart"/>
+      <w:r>
+        <w:t>adress</w:t>
+      </w:r>
+      <w:proofErr w:type="spellEnd"/>
+      <w:r>
+        <w:t xml:space="preserve">: falsche Adresse, schauen ob </w:t>
+      </w:r>
+      <w:proofErr w:type="spellStart"/>
+      <w:r>
+        <w:t>base</w:t>
+      </w:r>
+      <w:proofErr w:type="spellEnd"/>
+      <w:r>
+        <w:t xml:space="preserve"> </w:t>
+      </w:r>
+      <w:proofErr w:type="spellStart"/>
+      <w:r>
+        <w:t>adress</w:t>
+      </w:r>
+      <w:proofErr w:type="spellEnd"/>
+      <w:r>
+        <w:t xml:space="preserve"> unter Options passt, um die richtigen Werte aus der Tabelle verwenden zu können muss hier 1 sein</w:t>
       </w:r>
     </w:p>
     <w:p>
@@ -82,8 +116,13 @@
       <w:pPr>
         <w:pStyle w:val="berschrift1"/>
       </w:pPr>
-      <w:r>
-        <w:t>Desigo CC</w:t>
+      <w:proofErr w:type="spellStart"/>
+      <w:r>
+        <w:t>Desigo</w:t>
+      </w:r>
+      <w:proofErr w:type="spellEnd"/>
+      <w:r>
+        <w:t xml:space="preserve"> CC</w:t>
       </w:r>
     </w:p>
     <w:p>
@@ -158,7 +197,21 @@
         </w:numPr>
       </w:pPr>
       <w:r>
-        <w:t>Offset PDE: aus, Offset Desigo: 1</w:t>
+        <w:t>Offset PDE</w:t>
+      </w:r>
+      <w:r>
+        <w:t xml:space="preserve"> =</w:t>
+      </w:r>
+      <w:r>
+        <w:t xml:space="preserve"> Offset </w:t>
+      </w:r>
+      <w:proofErr w:type="spellStart"/>
+      <w:r>
+        <w:t>Desigo</w:t>
+      </w:r>
+      <w:proofErr w:type="spellEnd"/>
+      <w:r>
+        <w:t>, muss glaube ich 1 sein</w:t>
       </w:r>
     </w:p>
     <w:sectPr>

</xml_diff>